<commit_message>
Add .gitignore, READMEs, requirements; remove cache and db files
</commit_message>
<xml_diff>
--- a/Proj/Project proposal_ CMS.docx
+++ b/Proj/Project proposal_ CMS.docx
@@ -497,25 +497,7 @@
                 <w:szCs w:val="20"/>
                 <w:rtl w:val="0"/>
               </w:rPr>
-              <w:t xml:space="preserve">Premiga</w:t>
-            </w:r>
-            <w:r>
-              <w:rPr>
-                <w:rFonts w:ascii="Comic Sans MS" w:cs="Comic Sans MS" w:eastAsia="Comic Sans MS" w:hAnsi="Comic Sans MS"/>
-                <w:sz w:val="20"/>
-                <w:szCs w:val="20"/>
-                <w:rtl w:val="0"/>
-              </w:rPr>
-              <w:t xml:space="preserve"> </w:t>
-            </w:r>
-            <w:r>
-              <w:rPr>
-                <w:rFonts w:ascii="Comic Sans MS" w:cs="Comic Sans MS" w:eastAsia="Comic Sans MS" w:hAnsi="Comic Sans MS"/>
-                <w:sz w:val="20"/>
-                <w:szCs w:val="20"/>
-                <w:rtl w:val="0"/>
-              </w:rPr>
-              <w:t xml:space="preserve">Pengtap</w:t>
+              <w:t xml:space="preserve">Premiga Pengtap</w:t>
             </w:r>
             <w:r>
               <w:rPr>
@@ -968,7 +950,7 @@
           <w:szCs w:val="20"/>
           <w:rtl w:val="0"/>
         </w:rPr>
-        <w:t xml:space="preserve">1) Toyota production Crisis (2009)</w:t>
+        <w:t xml:space="preserve">1) Toyota Production Crisis (2009)</w:t>
       </w:r>
     </w:p>
     <w:p>
@@ -987,7 +969,7 @@
           <w:szCs w:val="20"/>
           <w:rtl w:val="0"/>
         </w:rPr>
-        <w:t xml:space="preserve">  - Because the company became bigger, they faced control inefficiency in the management system. It shows it can cause slow decision-making and also lose of productivity.</w:t>
+        <w:t xml:space="preserve">  - Because the company became bigger, they faced control inefficiency in the management system. It shows it can cause slow decision-making and also loss of productivity.</w:t>
       </w:r>
     </w:p>
     <w:p>
@@ -1006,7 +988,7 @@
           <w:szCs w:val="20"/>
           <w:rtl w:val="0"/>
         </w:rPr>
-        <w:t xml:space="preserve">2) Blockbuster depended only on physical stores while Netflix is launched.It shows the failure to adopt new technology.</w:t>
+        <w:t xml:space="preserve">2) Blockbuster depended only on physical stores while Netflix launched online streaming. It shows the failure to adopt new technology.</w:t>
       </w:r>
     </w:p>
     <w:p>
@@ -1407,7 +1389,7 @@
           <w:rtl w:val="0"/>
         </w:rPr>
         <w:tab/>
-        <w:t xml:space="preserve">- Data / Contack_list / Approve / Helpdesk / Logout</w:t>
+        <w:t xml:space="preserve">- Data / Contact_List / Approve / Helpdesk / Logout</w:t>
       </w:r>
     </w:p>
     <w:p>
@@ -1449,7 +1431,83 @@
           <w:rtl w:val="0"/>
         </w:rPr>
         <w:tab/>
-        <w:t xml:space="preserve">- </w:t>
+        <w:t xml:space="preserve">- SQL database: all data is stored in local JSON files (users, requests, reports).</w:t>
+      </w:r>
+    </w:p>
+    <w:p>
+      <w:pPr>
+        <w:rPr>
+          <w:rFonts w:ascii="Comic Sans MS" w:cs="Comic Sans MS" w:eastAsia="Comic Sans MS" w:hAnsi="Comic Sans MS"/>
+          <w:sz w:val="20"/>
+          <w:szCs w:val="20"/>
+        </w:rPr>
+      </w:pPr>
+      <w:r>
+        <w:rPr>
+          <w:rFonts w:ascii="Comic Sans MS" w:cs="Comic Sans MS" w:eastAsia="Comic Sans MS" w:hAnsi="Comic Sans MS"/>
+          <w:sz w:val="20"/>
+          <w:szCs w:val="20"/>
+          <w:rtl w:val="0"/>
+        </w:rPr>
+        <w:tab/>
+        <w:t xml:space="preserve">- Network / multi-computer use: the app runs on one computer only.</w:t>
+      </w:r>
+    </w:p>
+    <w:p>
+      <w:pPr>
+        <w:rPr>
+          <w:rFonts w:ascii="Comic Sans MS" w:cs="Comic Sans MS" w:eastAsia="Comic Sans MS" w:hAnsi="Comic Sans MS"/>
+          <w:sz w:val="20"/>
+          <w:szCs w:val="20"/>
+        </w:rPr>
+      </w:pPr>
+      <w:r>
+        <w:rPr>
+          <w:rFonts w:ascii="Comic Sans MS" w:cs="Comic Sans MS" w:eastAsia="Comic Sans MS" w:hAnsi="Comic Sans MS"/>
+          <w:sz w:val="20"/>
+          <w:szCs w:val="20"/>
+          <w:rtl w:val="0"/>
+        </w:rPr>
+        <w:tab/>
+        <w:t xml:space="preserve">- Real file upload: attachments are saved as a path to a file on the same computer.</w:t>
+      </w:r>
+    </w:p>
+    <w:p>
+      <w:pPr>
+        <w:rPr>
+          <w:rFonts w:ascii="Comic Sans MS" w:cs="Comic Sans MS" w:eastAsia="Comic Sans MS" w:hAnsi="Comic Sans MS"/>
+          <w:sz w:val="20"/>
+          <w:szCs w:val="20"/>
+        </w:rPr>
+      </w:pPr>
+      <w:r>
+        <w:rPr>
+          <w:rFonts w:ascii="Comic Sans MS" w:cs="Comic Sans MS" w:eastAsia="Comic Sans MS" w:hAnsi="Comic Sans MS"/>
+          <w:sz w:val="20"/>
+          <w:szCs w:val="20"/>
+          <w:rtl w:val="0"/>
+        </w:rPr>
+        <w:tab/>
+        <w:t xml:space="preserve">- Email or push notifications for new requests and helpdesk tickets.</w:t>
+      </w:r>
+    </w:p>
+    <w:p>
+      <w:pPr>
+        <w:rPr>
+          <w:rFonts w:ascii="Comic Sans MS" w:cs="Comic Sans MS" w:eastAsia="Comic Sans MS" w:hAnsi="Comic Sans MS"/>
+          <w:sz w:val="20"/>
+          <w:szCs w:val="20"/>
+        </w:rPr>
+      </w:pPr>
+      <w:r>
+        <w:rPr>
+          <w:rFonts w:ascii="Comic Sans MS" w:cs="Comic Sans MS" w:eastAsia="Comic Sans MS" w:hAnsi="Comic Sans MS"/>
+          <w:sz w:val="20"/>
+          <w:szCs w:val="20"/>
+          <w:rtl w:val="0"/>
+        </w:rPr>
+        <w:tab/>
+        <w:t xml:space="preserve">- Password reset / "forgot password" feature.</w:t>
       </w:r>
     </w:p>
     <w:p>
@@ -1491,7 +1549,83 @@
           <w:rtl w:val="0"/>
         </w:rPr>
         <w:tab/>
-        <w:t xml:space="preserve">-</w:t>
+        <w:t xml:space="preserve">- Desktop app built with Tkinter, so it only runs where Python is installed.</w:t>
+      </w:r>
+    </w:p>
+    <w:p>
+      <w:pPr>
+        <w:rPr>
+          <w:rFonts w:ascii="Comic Sans MS" w:cs="Comic Sans MS" w:eastAsia="Comic Sans MS" w:hAnsi="Comic Sans MS"/>
+          <w:sz w:val="20"/>
+          <w:szCs w:val="20"/>
+        </w:rPr>
+      </w:pPr>
+      <w:r>
+        <w:rPr>
+          <w:rFonts w:ascii="Comic Sans MS" w:cs="Comic Sans MS" w:eastAsia="Comic Sans MS" w:hAnsi="Comic Sans MS"/>
+          <w:sz w:val="20"/>
+          <w:szCs w:val="20"/>
+          <w:rtl w:val="0"/>
+        </w:rPr>
+        <w:tab/>
+        <w:t xml:space="preserve">- Fixed window sizes (1000x1000 login, 1800x1000 main page) may not fit small laptop screens.</w:t>
+      </w:r>
+    </w:p>
+    <w:p>
+      <w:pPr>
+        <w:rPr>
+          <w:rFonts w:ascii="Comic Sans MS" w:cs="Comic Sans MS" w:eastAsia="Comic Sans MS" w:hAnsi="Comic Sans MS"/>
+          <w:sz w:val="20"/>
+          <w:szCs w:val="20"/>
+        </w:rPr>
+      </w:pPr>
+      <w:r>
+        <w:rPr>
+          <w:rFonts w:ascii="Comic Sans MS" w:cs="Comic Sans MS" w:eastAsia="Comic Sans MS" w:hAnsi="Comic Sans MS"/>
+          <w:sz w:val="20"/>
+          <w:szCs w:val="20"/>
+          <w:rtl w:val="0"/>
+        </w:rPr>
+        <w:tab/>
+        <w:t xml:space="preserve">- JSON files are not safe when many users write at the same time.</w:t>
+      </w:r>
+    </w:p>
+    <w:p>
+      <w:pPr>
+        <w:rPr>
+          <w:rFonts w:ascii="Comic Sans MS" w:cs="Comic Sans MS" w:eastAsia="Comic Sans MS" w:hAnsi="Comic Sans MS"/>
+          <w:sz w:val="20"/>
+          <w:szCs w:val="20"/>
+        </w:rPr>
+      </w:pPr>
+      <w:r>
+        <w:rPr>
+          <w:rFonts w:ascii="Comic Sans MS" w:cs="Comic Sans MS" w:eastAsia="Comic Sans MS" w:hAnsi="Comic Sans MS"/>
+          <w:sz w:val="20"/>
+          <w:szCs w:val="20"/>
+          <w:rtl w:val="0"/>
+        </w:rPr>
+        <w:tab/>
+        <w:t xml:space="preserve">- Requires the external libraries Pillow and tkcalendar (pip install Pillow tkcalendar).</w:t>
+      </w:r>
+    </w:p>
+    <w:p>
+      <w:pPr>
+        <w:rPr>
+          <w:rFonts w:ascii="Comic Sans MS" w:cs="Comic Sans MS" w:eastAsia="Comic Sans MS" w:hAnsi="Comic Sans MS"/>
+          <w:sz w:val="20"/>
+          <w:szCs w:val="20"/>
+        </w:rPr>
+      </w:pPr>
+      <w:r>
+        <w:rPr>
+          <w:rFonts w:ascii="Comic Sans MS" w:cs="Comic Sans MS" w:eastAsia="Comic Sans MS" w:hAnsi="Comic Sans MS"/>
+          <w:sz w:val="20"/>
+          <w:szCs w:val="20"/>
+          <w:rtl w:val="0"/>
+        </w:rPr>
+        <w:tab/>
+        <w:t xml:space="preserve">- Passwords are hashed (PBKDF2), but there is no account lockout after failed logins.</w:t>
       </w:r>
     </w:p>
     <w:p>
@@ -4311,7 +4445,7 @@
           <w:rtl w:val="0"/>
         </w:rPr>
         <w:tab/>
-        <w:t xml:space="preserve">- SQL (Maybe..)</w:t>
+        <w:t xml:space="preserve">- JSON (data storage)</w:t>
       </w:r>
     </w:p>
     <w:p>
@@ -4367,26 +4501,7 @@
           <w:rtl w:val="0"/>
         </w:rPr>
         <w:tab/>
-        <w:t xml:space="preserve">- dateTime</w:t>
-      </w:r>
-    </w:p>
-    <w:p>
-      <w:pPr>
-        <w:rPr>
-          <w:rFonts w:ascii="Comic Sans MS" w:cs="Comic Sans MS" w:eastAsia="Comic Sans MS" w:hAnsi="Comic Sans MS"/>
-          <w:sz w:val="20"/>
-          <w:szCs w:val="20"/>
-        </w:rPr>
-      </w:pPr>
-      <w:r>
-        <w:rPr>
-          <w:rFonts w:ascii="Comic Sans MS" w:cs="Comic Sans MS" w:eastAsia="Comic Sans MS" w:hAnsi="Comic Sans MS"/>
-          <w:sz w:val="20"/>
-          <w:szCs w:val="20"/>
-          <w:rtl w:val="0"/>
-        </w:rPr>
-        <w:tab/>
-        <w:t xml:space="preserve">- math</w:t>
+        <w:t xml:space="preserve">- datetime</w:t>
       </w:r>
     </w:p>
     <w:p>
@@ -4424,45 +4539,45 @@
           <w:rtl w:val="0"/>
         </w:rPr>
         <w:tab/>
-        <w:t xml:space="preserve">- sqlite3</w:t>
-      </w:r>
-    </w:p>
-    <w:p>
-      <w:pPr>
-        <w:rPr>
-          <w:rFonts w:ascii="Comic Sans MS" w:cs="Comic Sans MS" w:eastAsia="Comic Sans MS" w:hAnsi="Comic Sans MS"/>
-          <w:sz w:val="20"/>
-          <w:szCs w:val="20"/>
-        </w:rPr>
-      </w:pPr>
-      <w:r>
-        <w:rPr>
-          <w:rFonts w:ascii="Comic Sans MS" w:cs="Comic Sans MS" w:eastAsia="Comic Sans MS" w:hAnsi="Comic Sans MS"/>
-          <w:sz w:val="20"/>
-          <w:szCs w:val="20"/>
-          <w:rtl w:val="0"/>
-        </w:rPr>
-        <w:tab/>
-        <w:t xml:space="preserve">- matplotlib</w:t>
-      </w:r>
-    </w:p>
-    <w:p>
-      <w:pPr>
-        <w:rPr>
-          <w:rFonts w:ascii="Comic Sans MS" w:cs="Comic Sans MS" w:eastAsia="Comic Sans MS" w:hAnsi="Comic Sans MS"/>
-          <w:sz w:val="20"/>
-          <w:szCs w:val="20"/>
-        </w:rPr>
-      </w:pPr>
-      <w:r>
-        <w:rPr>
-          <w:rFonts w:ascii="Comic Sans MS" w:cs="Comic Sans MS" w:eastAsia="Comic Sans MS" w:hAnsi="Comic Sans MS"/>
-          <w:sz w:val="20"/>
-          <w:szCs w:val="20"/>
-          <w:rtl w:val="0"/>
-        </w:rPr>
-        <w:tab/>
-        <w:t xml:space="preserve">- ABC, abstractmethod</w:t>
+        <w:t xml:space="preserve">- Pillow (PIL) - background image</w:t>
+      </w:r>
+    </w:p>
+    <w:p>
+      <w:pPr>
+        <w:rPr>
+          <w:rFonts w:ascii="Comic Sans MS" w:cs="Comic Sans MS" w:eastAsia="Comic Sans MS" w:hAnsi="Comic Sans MS"/>
+          <w:sz w:val="20"/>
+          <w:szCs w:val="20"/>
+        </w:rPr>
+      </w:pPr>
+      <w:r>
+        <w:rPr>
+          <w:rFonts w:ascii="Comic Sans MS" w:cs="Comic Sans MS" w:eastAsia="Comic Sans MS" w:hAnsi="Comic Sans MS"/>
+          <w:sz w:val="20"/>
+          <w:szCs w:val="20"/>
+          <w:rtl w:val="0"/>
+        </w:rPr>
+        <w:tab/>
+        <w:t xml:space="preserve">- tkcalendar - birthday picker</w:t>
+      </w:r>
+    </w:p>
+    <w:p>
+      <w:pPr>
+        <w:rPr>
+          <w:rFonts w:ascii="Comic Sans MS" w:cs="Comic Sans MS" w:eastAsia="Comic Sans MS" w:hAnsi="Comic Sans MS"/>
+          <w:sz w:val="20"/>
+          <w:szCs w:val="20"/>
+        </w:rPr>
+      </w:pPr>
+      <w:r>
+        <w:rPr>
+          <w:rFonts w:ascii="Comic Sans MS" w:cs="Comic Sans MS" w:eastAsia="Comic Sans MS" w:hAnsi="Comic Sans MS"/>
+          <w:sz w:val="20"/>
+          <w:szCs w:val="20"/>
+          <w:rtl w:val="0"/>
+        </w:rPr>
+        <w:tab/>
+        <w:t xml:space="preserve">- hashlib, hmac - password hashing</w:t>
       </w:r>
     </w:p>
     <w:p>
@@ -4520,6 +4635,25 @@
         </w:rPr>
         <w:tab/>
         <w:t xml:space="preserve">- os</w:t>
+      </w:r>
+    </w:p>
+    <w:p>
+      <w:pPr>
+        <w:rPr>
+          <w:rFonts w:ascii="Comic Sans MS" w:cs="Comic Sans MS" w:eastAsia="Comic Sans MS" w:hAnsi="Comic Sans MS"/>
+          <w:sz w:val="20"/>
+          <w:szCs w:val="20"/>
+        </w:rPr>
+      </w:pPr>
+      <w:r>
+        <w:rPr>
+          <w:rFonts w:ascii="Comic Sans MS" w:cs="Comic Sans MS" w:eastAsia="Comic Sans MS" w:hAnsi="Comic Sans MS"/>
+          <w:sz w:val="20"/>
+          <w:szCs w:val="20"/>
+          <w:rtl w:val="0"/>
+        </w:rPr>
+        <w:tab/>
+        <w:t xml:space="preserve">- shutil, uuid, pathlib, random</w:t>
       </w:r>
     </w:p>
     <w:p>

</xml_diff>